<commit_message>
Add AWS CLI full setup guide appendix with teardown steps
</commit_message>
<xml_diff>
--- a/setup-guide/cicd-aws-setup-guide.docx
+++ b/setup-guide/cicd-aws-setup-guide.docx
@@ -3727,6 +3727,794 @@
         </w:tc>
       </w:tr>
     </w:tbl>
+    <w:p>
+      <w:pPr>
+        <w:pStyle w:val="Heading1"/>
+      </w:pPr>
+      <w:r>
+        <w:t>Appendix: Full Setup Using AWS CLI</w:t>
+      </w:r>
+    </w:p>
+    <w:p>
+      <w:r>
+        <w:t>This section walks through every step of the setup using AWS CLI commands only — no console required. Run these commands in order from your local machine with AWS CLI configured and an IAM user with sufficient permissions.</w:t>
+      </w:r>
+    </w:p>
+    <w:p>
+      <w:r>
+        <w:t>Prerequisites: AWS CLI configured (aws configure), Git installed, account ID and region set.</w:t>
+      </w:r>
+    </w:p>
+    <w:p>
+      <w:pPr/>
+      <w:r>
+        <w:rPr>
+          <w:rFonts w:ascii="Courier New" w:hAnsi="Courier New"/>
+          <w:sz w:val="18"/>
+        </w:rPr>
+        <w:t>export AWS_REGION=us-east-1</w:t>
+        <w:br/>
+        <w:t>export ACCOUNT_ID=$(aws sts get-caller-identity --query Account --output text)</w:t>
+        <w:br/>
+        <w:t>export APP_NAME=demo-app</w:t>
+        <w:br/>
+        <w:t>export BUCKET=demo-app-artifacts-${ACCOUNT_ID}</w:t>
+      </w:r>
+    </w:p>
+    <w:p>
+      <w:pPr>
+        <w:pStyle w:val="Heading2"/>
+      </w:pPr>
+      <w:r>
+        <w:t>CLI Step 1: Create CodeCommit Repository</w:t>
+      </w:r>
+    </w:p>
+    <w:p>
+      <w:pPr/>
+      <w:r>
+        <w:rPr>
+          <w:rFonts w:ascii="Courier New" w:hAnsi="Courier New"/>
+          <w:sz w:val="18"/>
+        </w:rPr>
+        <w:t>aws codecommit create-repository \</w:t>
+        <w:br/>
+        <w:t xml:space="preserve">  --repository-name $APP_NAME \</w:t>
+        <w:br/>
+        <w:t xml:space="preserve">  --region $AWS_REGION</w:t>
+        <w:br/>
+        <w:br/>
+        <w:t># Clone and push your app files</w:t>
+        <w:br/>
+        <w:t>git clone https://git-codecommit.$AWS_REGION.amazonaws.com/v1/repos/$APP_NAME</w:t>
+        <w:br/>
+        <w:t>cd $APP_NAME</w:t>
+        <w:br/>
+        <w:t># Copy your app files in, then:</w:t>
+        <w:br/>
+        <w:t>git add .</w:t>
+        <w:br/>
+        <w:t>git commit -m "Initial commit"</w:t>
+        <w:br/>
+        <w:t>git push origin master</w:t>
+      </w:r>
+    </w:p>
+    <w:p>
+      <w:pPr>
+        <w:pStyle w:val="Heading2"/>
+      </w:pPr>
+      <w:r>
+        <w:t>CLI Step 2: Create S3 Artifact Bucket</w:t>
+      </w:r>
+    </w:p>
+    <w:p>
+      <w:pPr/>
+      <w:r>
+        <w:rPr>
+          <w:rFonts w:ascii="Courier New" w:hAnsi="Courier New"/>
+          <w:sz w:val="18"/>
+        </w:rPr>
+        <w:t># Create bucket</w:t>
+        <w:br/>
+        <w:t>aws s3api create-bucket \</w:t>
+        <w:br/>
+        <w:t xml:space="preserve">  --bucket $BUCKET \</w:t>
+        <w:br/>
+        <w:t xml:space="preserve">  --region $AWS_REGION \</w:t>
+        <w:br/>
+        <w:t xml:space="preserve">  --create-bucket-configuration LocationConstraint=$AWS_REGION</w:t>
+        <w:br/>
+        <w:br/>
+        <w:t># Enable versioning</w:t>
+        <w:br/>
+        <w:t>aws s3api put-bucket-versioning \</w:t>
+        <w:br/>
+        <w:t xml:space="preserve">  --bucket $BUCKET \</w:t>
+        <w:br/>
+        <w:t xml:space="preserve">  --versioning-configuration Status=Enabled</w:t>
+        <w:br/>
+        <w:br/>
+        <w:t># Block public access</w:t>
+        <w:br/>
+        <w:t>aws s3api put-public-access-block \</w:t>
+        <w:br/>
+        <w:t xml:space="preserve">  --bucket $BUCKET \</w:t>
+        <w:br/>
+        <w:t xml:space="preserve">  --public-access-block-configuration \</w:t>
+        <w:br/>
+        <w:t xml:space="preserve">    BlockPublicAcls=true,IgnorePublicAcls=true,\</w:t>
+        <w:br/>
+        <w:t xml:space="preserve">    BlockPublicPolicy=true,RestrictPublicBuckets=true</w:t>
+      </w:r>
+    </w:p>
+    <w:p>
+      <w:pPr>
+        <w:pStyle w:val="Heading2"/>
+      </w:pPr>
+      <w:r>
+        <w:t>CLI Step 3: Create IAM Roles</w:t>
+      </w:r>
+    </w:p>
+    <w:p>
+      <w:r>
+        <w:t>Create trust policy files, then create each role and attach policies.</w:t>
+      </w:r>
+    </w:p>
+    <w:p>
+      <w:pPr>
+        <w:pStyle w:val="Heading3"/>
+      </w:pPr>
+      <w:r>
+        <w:t>CodeBuild Role</w:t>
+      </w:r>
+    </w:p>
+    <w:p>
+      <w:pPr/>
+      <w:r>
+        <w:rPr>
+          <w:rFonts w:ascii="Courier New" w:hAnsi="Courier New"/>
+          <w:sz w:val="18"/>
+        </w:rPr>
+        <w:t># Trust policy</w:t>
+        <w:br/>
+        <w:t>cat &gt; /tmp/codebuild-trust.json &lt;&lt; EOF</w:t>
+        <w:br/>
+        <w:t>{"Version":"2012-10-17","Statement":[{"Effect":"Allow",</w:t>
+        <w:br/>
+        <w:t>"Principal":{"Service":"codebuild.amazonaws.com"},"Action":"sts:AssumeRole"}]}</w:t>
+        <w:br/>
+        <w:t>EOF</w:t>
+        <w:br/>
+        <w:br/>
+        <w:t>aws iam create-role \</w:t>
+        <w:br/>
+        <w:t xml:space="preserve">  --role-name CodeBuildRole-demo-app \</w:t>
+        <w:br/>
+        <w:t xml:space="preserve">  --assume-role-policy-document file:///tmp/codebuild-trust.json</w:t>
+        <w:br/>
+        <w:br/>
+        <w:t>aws iam attach-role-policy \</w:t>
+        <w:br/>
+        <w:t xml:space="preserve">  --role-name CodeBuildRole-demo-app \</w:t>
+        <w:br/>
+        <w:t xml:space="preserve">  --policy-arn arn:aws:iam::aws:policy/AWSCodeBuildAdminAccess</w:t>
+        <w:br/>
+        <w:br/>
+        <w:t>aws iam attach-role-policy \</w:t>
+        <w:br/>
+        <w:t xml:space="preserve">  --role-name CodeBuildRole-demo-app \</w:t>
+        <w:br/>
+        <w:t xml:space="preserve">  --policy-arn arn:aws:iam::aws:policy/AmazonS3FullAccess</w:t>
+        <w:br/>
+        <w:br/>
+        <w:t>aws iam attach-role-policy \</w:t>
+        <w:br/>
+        <w:t xml:space="preserve">  --role-name CodeBuildRole-demo-app \</w:t>
+        <w:br/>
+        <w:t xml:space="preserve">  --policy-arn arn:aws:iam::aws:policy/CloudWatchLogsFullAccess</w:t>
+      </w:r>
+    </w:p>
+    <w:p>
+      <w:pPr>
+        <w:pStyle w:val="Heading3"/>
+      </w:pPr>
+      <w:r>
+        <w:t>CodeDeploy Role</w:t>
+      </w:r>
+    </w:p>
+    <w:p>
+      <w:pPr/>
+      <w:r>
+        <w:rPr>
+          <w:rFonts w:ascii="Courier New" w:hAnsi="Courier New"/>
+          <w:sz w:val="18"/>
+        </w:rPr>
+        <w:t>cat &gt; /tmp/codedeploy-trust.json &lt;&lt; EOF</w:t>
+        <w:br/>
+        <w:t>{"Version":"2012-10-17","Statement":[{"Effect":"Allow",</w:t>
+        <w:br/>
+        <w:t>"Principal":{"Service":"codedeploy.amazonaws.com"},"Action":"sts:AssumeRole"}]}</w:t>
+        <w:br/>
+        <w:t>EOF</w:t>
+        <w:br/>
+        <w:br/>
+        <w:t>aws iam create-role \</w:t>
+        <w:br/>
+        <w:t xml:space="preserve">  --role-name CodeDeployRole-demo-app \</w:t>
+        <w:br/>
+        <w:t xml:space="preserve">  --assume-role-policy-document file:///tmp/codedeploy-trust.json</w:t>
+        <w:br/>
+        <w:br/>
+        <w:t>aws iam attach-role-policy \</w:t>
+        <w:br/>
+        <w:t xml:space="preserve">  --role-name CodeDeployRole-demo-app \</w:t>
+        <w:br/>
+        <w:t xml:space="preserve">  --policy-arn arn:aws:iam::aws:policy/service-role/AWSCodeDeployRole</w:t>
+      </w:r>
+    </w:p>
+    <w:p>
+      <w:pPr>
+        <w:pStyle w:val="Heading3"/>
+      </w:pPr>
+      <w:r>
+        <w:t>CodePipeline Role</w:t>
+      </w:r>
+    </w:p>
+    <w:p>
+      <w:pPr/>
+      <w:r>
+        <w:rPr>
+          <w:rFonts w:ascii="Courier New" w:hAnsi="Courier New"/>
+          <w:sz w:val="18"/>
+        </w:rPr>
+        <w:t>cat &gt; /tmp/codepipeline-trust.json &lt;&lt; EOF</w:t>
+        <w:br/>
+        <w:t>{"Version":"2012-10-17","Statement":[{"Effect":"Allow",</w:t>
+        <w:br/>
+        <w:t>"Principal":{"Service":"codepipeline.amazonaws.com"},"Action":"sts:AssumeRole"}]}</w:t>
+        <w:br/>
+        <w:t>EOF</w:t>
+        <w:br/>
+        <w:br/>
+        <w:t>aws iam create-role \</w:t>
+        <w:br/>
+        <w:t xml:space="preserve">  --role-name CodePipelineRole-demo-app \</w:t>
+        <w:br/>
+        <w:t xml:space="preserve">  --assume-role-policy-document file:///tmp/codepipeline-trust.json</w:t>
+        <w:br/>
+        <w:br/>
+        <w:t>aws iam attach-role-policy \</w:t>
+        <w:br/>
+        <w:t xml:space="preserve">  --role-name CodePipelineRole-demo-app \</w:t>
+        <w:br/>
+        <w:t xml:space="preserve">  --policy-arn arn:aws:iam::aws:policy/AWSCodePipeline_FullAccess</w:t>
+        <w:br/>
+        <w:br/>
+        <w:t>aws iam attach-role-policy \</w:t>
+        <w:br/>
+        <w:t xml:space="preserve">  --role-name CodePipelineRole-demo-app \</w:t>
+        <w:br/>
+        <w:t xml:space="preserve">  --policy-arn arn:aws:iam::aws:policy/AmazonS3FullAccess</w:t>
+      </w:r>
+    </w:p>
+    <w:p>
+      <w:pPr>
+        <w:pStyle w:val="Heading3"/>
+      </w:pPr>
+      <w:r>
+        <w:t>EC2 Instance Profile</w:t>
+      </w:r>
+    </w:p>
+    <w:p>
+      <w:pPr/>
+      <w:r>
+        <w:rPr>
+          <w:rFonts w:ascii="Courier New" w:hAnsi="Courier New"/>
+          <w:sz w:val="18"/>
+        </w:rPr>
+        <w:t>cat &gt; /tmp/ec2-trust.json &lt;&lt; EOF</w:t>
+        <w:br/>
+        <w:t>{"Version":"2012-10-17","Statement":[{"Effect":"Allow",</w:t>
+        <w:br/>
+        <w:t>"Principal":{"Service":"ec2.amazonaws.com"},"Action":"sts:AssumeRole"}]}</w:t>
+        <w:br/>
+        <w:t>EOF</w:t>
+        <w:br/>
+        <w:br/>
+        <w:t>aws iam create-role \</w:t>
+        <w:br/>
+        <w:t xml:space="preserve">  --role-name EC2CodeDeployRole \</w:t>
+        <w:br/>
+        <w:t xml:space="preserve">  --assume-role-policy-document file:///tmp/ec2-trust.json</w:t>
+        <w:br/>
+        <w:br/>
+        <w:t>aws iam attach-role-policy \</w:t>
+        <w:br/>
+        <w:t xml:space="preserve">  --role-name EC2CodeDeployRole \</w:t>
+        <w:br/>
+        <w:t xml:space="preserve">  --policy-arn arn:aws:iam::aws:policy/service-role/AmazonEC2RoleforAWSCodeDeploy</w:t>
+        <w:br/>
+        <w:br/>
+        <w:t>aws iam attach-role-policy \</w:t>
+        <w:br/>
+        <w:t xml:space="preserve">  --role-name EC2CodeDeployRole \</w:t>
+        <w:br/>
+        <w:t xml:space="preserve">  --policy-arn arn:aws:iam::aws:policy/AmazonSSMManagedInstanceCore</w:t>
+        <w:br/>
+        <w:br/>
+        <w:t>aws iam create-instance-profile \</w:t>
+        <w:br/>
+        <w:t xml:space="preserve">  --instance-profile-name EC2CodeDeployProfile</w:t>
+        <w:br/>
+        <w:br/>
+        <w:t>aws iam add-role-to-instance-profile \</w:t>
+        <w:br/>
+        <w:t xml:space="preserve">  --instance-profile-name EC2CodeDeployProfile \</w:t>
+        <w:br/>
+        <w:t xml:space="preserve">  --role-name EC2CodeDeployRole</w:t>
+      </w:r>
+    </w:p>
+    <w:p>
+      <w:pPr>
+        <w:pStyle w:val="Heading2"/>
+      </w:pPr>
+      <w:r>
+        <w:t>CLI Step 4: Create CodeBuild Project</w:t>
+      </w:r>
+    </w:p>
+    <w:p>
+      <w:pPr/>
+      <w:r>
+        <w:rPr>
+          <w:rFonts w:ascii="Courier New" w:hAnsi="Courier New"/>
+          <w:sz w:val="18"/>
+        </w:rPr>
+        <w:t>aws codebuild create-project \</w:t>
+        <w:br/>
+        <w:t xml:space="preserve">  --name demo-app-build \</w:t>
+        <w:br/>
+        <w:t xml:space="preserve">  --source type=CODECOMMIT,location=https://git-codecommit.$AWS_REGION.amazonaws.com/v1/repos/$APP_NAME \</w:t>
+        <w:br/>
+        <w:t xml:space="preserve">  --source-version refs/heads/master \</w:t>
+        <w:br/>
+        <w:t xml:space="preserve">  --artifacts type=S3,location=$BUCKET,packaging=ZIP,name=build-output \</w:t>
+        <w:br/>
+        <w:t xml:space="preserve">  --environment type=LINUX_CONTAINER,computeType=BUILD_GENERAL1_SMALL,\</w:t>
+        <w:br/>
+        <w:t>image=aws/codebuild/amazonlinux2-x86_64-standard:5.0 \</w:t>
+        <w:br/>
+        <w:t xml:space="preserve">  --service-role arn:aws:iam::$ACCOUNT_ID:role/CodeBuildRole-demo-app \</w:t>
+        <w:br/>
+        <w:t xml:space="preserve">  --region $AWS_REGION</w:t>
+      </w:r>
+    </w:p>
+    <w:p>
+      <w:pPr>
+        <w:pStyle w:val="Heading2"/>
+      </w:pPr>
+      <w:r>
+        <w:t>CLI Step 5: Launch EC2 Instance</w:t>
+      </w:r>
+    </w:p>
+    <w:p>
+      <w:pPr/>
+      <w:r>
+        <w:rPr>
+          <w:rFonts w:ascii="Courier New" w:hAnsi="Courier New"/>
+          <w:sz w:val="18"/>
+        </w:rPr>
+        <w:t># Get latest Amazon Linux 2023 AMI</w:t>
+        <w:br/>
+        <w:t>AMI=$(aws ec2 describe-images \</w:t>
+        <w:br/>
+        <w:t xml:space="preserve">  --owners amazon \</w:t>
+        <w:br/>
+        <w:t xml:space="preserve">  --filters "Name=name,Values=al2023-ami-*-x86_64" \</w:t>
+        <w:br/>
+        <w:t xml:space="preserve">            "Name=state,Values=available" \</w:t>
+        <w:br/>
+        <w:t xml:space="preserve">  --query "sort_by(Images,&amp;CreationDate)[-1].ImageId" \</w:t>
+        <w:br/>
+        <w:t xml:space="preserve">  --output text)</w:t>
+        <w:br/>
+        <w:br/>
+        <w:t># Create security group</w:t>
+        <w:br/>
+        <w:t>SG_ID=$(aws ec2 create-security-group \</w:t>
+        <w:br/>
+        <w:t xml:space="preserve">  --group-name demo-app-sg \</w:t>
+        <w:br/>
+        <w:t xml:space="preserve">  --description "demo-app security group" \</w:t>
+        <w:br/>
+        <w:t xml:space="preserve">  --query GroupId --output text)</w:t>
+        <w:br/>
+        <w:br/>
+        <w:t>aws ec2 authorize-security-group-ingress --group-id $SG_ID --protocol tcp --port 80 --cidr 0.0.0.0/0</w:t>
+        <w:br/>
+        <w:t>aws ec2 authorize-security-group-ingress --group-id $SG_ID --protocol tcp --port 22 --cidr 0.0.0.0/0</w:t>
+        <w:br/>
+        <w:br/>
+        <w:t># Launch instance</w:t>
+        <w:br/>
+        <w:t>INSTANCE_ID=$(aws ec2 run-instances \</w:t>
+        <w:br/>
+        <w:t xml:space="preserve">  --image-id $AMI \</w:t>
+        <w:br/>
+        <w:t xml:space="preserve">  --instance-type t2.micro \</w:t>
+        <w:br/>
+        <w:t xml:space="preserve">  --iam-instance-profile Name=EC2CodeDeployProfile \</w:t>
+        <w:br/>
+        <w:t xml:space="preserve">  --security-group-ids $SG_ID \</w:t>
+        <w:br/>
+        <w:t xml:space="preserve">  --tag-specifications \</w:t>
+        <w:br/>
+        <w:t xml:space="preserve">    "ResourceType=instance,Tags=[{Key=Name,Value=demo-app-server}]" \</w:t>
+        <w:br/>
+        <w:t xml:space="preserve">  --query "Instances[0].InstanceId" --output text)</w:t>
+        <w:br/>
+        <w:br/>
+        <w:t>echo "Instance launched: $INSTANCE_ID"</w:t>
+        <w:br/>
+        <w:t>aws ec2 wait instance-running --instance-ids $INSTANCE_ID</w:t>
+      </w:r>
+    </w:p>
+    <w:p>
+      <w:pPr>
+        <w:pStyle w:val="Heading3"/>
+      </w:pPr>
+      <w:r>
+        <w:t>Install CodeDeploy Agent on EC2 (via SSM)</w:t>
+      </w:r>
+    </w:p>
+    <w:p>
+      <w:r>
+        <w:t>Use SSM Run Command to install the agent without SSH access:</w:t>
+      </w:r>
+    </w:p>
+    <w:p>
+      <w:pPr/>
+      <w:r>
+        <w:rPr>
+          <w:rFonts w:ascii="Courier New" w:hAnsi="Courier New"/>
+          <w:sz w:val="18"/>
+        </w:rPr>
+        <w:t>aws ssm send-command \</w:t>
+        <w:br/>
+        <w:t xml:space="preserve">  --instance-ids $INSTANCE_ID \</w:t>
+        <w:br/>
+        <w:t xml:space="preserve">  --document-name "AWS-RunShellScript" \</w:t>
+        <w:br/>
+        <w:t xml:space="preserve">  --parameters commands=[</w:t>
+        <w:br/>
+        <w:t xml:space="preserve">    "sudo yum update -y",</w:t>
+        <w:br/>
+        <w:t xml:space="preserve">    "sudo yum install -y ruby wget",</w:t>
+        <w:br/>
+        <w:t xml:space="preserve">    "cd /home/ec2-user",</w:t>
+        <w:br/>
+        <w:t xml:space="preserve">    "wget https://aws-codedeploy-$AWS_REGION.s3.$AWS_REGION.amazonaws.com/latest/install",</w:t>
+        <w:br/>
+        <w:t xml:space="preserve">    "chmod +x ./install",</w:t>
+        <w:br/>
+        <w:t xml:space="preserve">    "sudo ./install auto",</w:t>
+        <w:br/>
+        <w:t xml:space="preserve">    "sudo systemctl start codedeploy-agent",</w:t>
+        <w:br/>
+        <w:t xml:space="preserve">    "sudo yum install -y httpd",</w:t>
+        <w:br/>
+        <w:t xml:space="preserve">    "sudo systemctl start httpd",</w:t>
+        <w:br/>
+        <w:t xml:space="preserve">    "sudo systemctl enable httpd"</w:t>
+        <w:br/>
+        <w:t xml:space="preserve">  ] \</w:t>
+        <w:br/>
+        <w:t xml:space="preserve">  --region $AWS_REGION</w:t>
+      </w:r>
+    </w:p>
+    <w:p>
+      <w:pPr>
+        <w:pStyle w:val="Heading2"/>
+      </w:pPr>
+      <w:r>
+        <w:t>CLI Step 6: Create CodeDeploy Application &amp; Deployment Group</w:t>
+      </w:r>
+    </w:p>
+    <w:p>
+      <w:pPr/>
+      <w:r>
+        <w:rPr>
+          <w:rFonts w:ascii="Courier New" w:hAnsi="Courier New"/>
+          <w:sz w:val="18"/>
+        </w:rPr>
+        <w:t># Create application</w:t>
+        <w:br/>
+        <w:t>aws deploy create-application \</w:t>
+        <w:br/>
+        <w:t xml:space="preserve">  --application-name $APP_NAME \</w:t>
+        <w:br/>
+        <w:t xml:space="preserve">  --compute-platform Server</w:t>
+        <w:br/>
+        <w:br/>
+        <w:t># Create deployment group</w:t>
+        <w:br/>
+        <w:t>aws deploy create-deployment-group \</w:t>
+        <w:br/>
+        <w:t xml:space="preserve">  --application-name $APP_NAME \</w:t>
+        <w:br/>
+        <w:t xml:space="preserve">  --deployment-group-name demo-app-deployment-group \</w:t>
+        <w:br/>
+        <w:t xml:space="preserve">  --service-role-arn arn:aws:iam::$ACCOUNT_ID:role/CodeDeployRole-demo-app \</w:t>
+        <w:br/>
+        <w:t xml:space="preserve">  --deployment-config-name CodeDeployDefault.AllAtOnce \</w:t>
+        <w:br/>
+        <w:t xml:space="preserve">  --ec2-tag-filters Key=Name,Value=demo-app-server,Type=KEY_AND_VALUE \</w:t>
+        <w:br/>
+        <w:t xml:space="preserve">  --auto-rollback-configuration enabled=true,events=DEPLOYMENT_FAILURE</w:t>
+      </w:r>
+    </w:p>
+    <w:p>
+      <w:pPr>
+        <w:pStyle w:val="Heading2"/>
+      </w:pPr>
+      <w:r>
+        <w:t>CLI Step 7: Create CodePipeline</w:t>
+      </w:r>
+    </w:p>
+    <w:p>
+      <w:r>
+        <w:t>Create the pipeline definition JSON file and deploy it:</w:t>
+      </w:r>
+    </w:p>
+    <w:p>
+      <w:pPr/>
+      <w:r>
+        <w:rPr>
+          <w:rFonts w:ascii="Courier New" w:hAnsi="Courier New"/>
+          <w:sz w:val="18"/>
+        </w:rPr>
+        <w:t>cat &gt; /tmp/pipeline.json &lt;&lt; EOF</w:t>
+        <w:br/>
+        <w:t>{</w:t>
+        <w:br/>
+        <w:t xml:space="preserve">  "pipeline": {</w:t>
+        <w:br/>
+        <w:t xml:space="preserve">    "name": "demo-app-pipeline",</w:t>
+        <w:br/>
+        <w:t xml:space="preserve">    "roleArn": "arn:aws:iam::$ACCOUNT_ID:role/CodePipelineRole-demo-app",</w:t>
+        <w:br/>
+        <w:t xml:space="preserve">    "artifactStore": {</w:t>
+        <w:br/>
+        <w:t xml:space="preserve">      "type": "S3",</w:t>
+        <w:br/>
+        <w:t xml:space="preserve">      "location": "$BUCKET"</w:t>
+        <w:br/>
+        <w:t xml:space="preserve">    },</w:t>
+        <w:br/>
+        <w:t xml:space="preserve">    "executionMode": "SUPERSEDED",</w:t>
+        <w:br/>
+        <w:t xml:space="preserve">    "pipelineType": "V2",</w:t>
+        <w:br/>
+        <w:t xml:space="preserve">    "stages": [</w:t>
+        <w:br/>
+        <w:t xml:space="preserve">      {</w:t>
+        <w:br/>
+        <w:t xml:space="preserve">        "name": "Source",</w:t>
+        <w:br/>
+        <w:t xml:space="preserve">        "actions": [{</w:t>
+        <w:br/>
+        <w:t xml:space="preserve">          "name": "Source",</w:t>
+        <w:br/>
+        <w:t xml:space="preserve">          "actionTypeId": {</w:t>
+        <w:br/>
+        <w:t xml:space="preserve">            "category": "Source", "owner": "AWS",</w:t>
+        <w:br/>
+        <w:t xml:space="preserve">            "provider": "CodeCommit", "version": "1"</w:t>
+        <w:br/>
+        <w:t xml:space="preserve">          },</w:t>
+        <w:br/>
+        <w:t xml:space="preserve">          "configuration": {</w:t>
+        <w:br/>
+        <w:t xml:space="preserve">            "RepositoryName": "$APP_NAME",</w:t>
+        <w:br/>
+        <w:t xml:space="preserve">            "BranchName": "master",</w:t>
+        <w:br/>
+        <w:t xml:space="preserve">            "PollForSourceChanges": "false",</w:t>
+        <w:br/>
+        <w:t xml:space="preserve">            "OutputArtifactFormat": "CODE_ZIP"</w:t>
+        <w:br/>
+        <w:t xml:space="preserve">          },</w:t>
+        <w:br/>
+        <w:t xml:space="preserve">          "outputArtifacts": [{"name": "SourceArtifact"}]</w:t>
+        <w:br/>
+        <w:t xml:space="preserve">        }]</w:t>
+        <w:br/>
+        <w:t xml:space="preserve">      },</w:t>
+        <w:br/>
+        <w:t xml:space="preserve">      {</w:t>
+        <w:br/>
+        <w:t xml:space="preserve">        "name": "Deploy",</w:t>
+        <w:br/>
+        <w:t xml:space="preserve">        "actions": [{</w:t>
+        <w:br/>
+        <w:t xml:space="preserve">          "name": "Deploy",</w:t>
+        <w:br/>
+        <w:t xml:space="preserve">          "actionTypeId": {</w:t>
+        <w:br/>
+        <w:t xml:space="preserve">            "category": "Deploy", "owner": "AWS",</w:t>
+        <w:br/>
+        <w:t xml:space="preserve">            "provider": "CodeDeploy", "version": "1"</w:t>
+        <w:br/>
+        <w:t xml:space="preserve">          },</w:t>
+        <w:br/>
+        <w:t xml:space="preserve">          "configuration": {</w:t>
+        <w:br/>
+        <w:t xml:space="preserve">            "ApplicationName": "$APP_NAME",</w:t>
+        <w:br/>
+        <w:t xml:space="preserve">            "DeploymentGroupName": "demo-app-deployment-group"</w:t>
+        <w:br/>
+        <w:t xml:space="preserve">          },</w:t>
+        <w:br/>
+        <w:t xml:space="preserve">          "inputArtifacts": [{"name": "SourceArtifact"}]</w:t>
+        <w:br/>
+        <w:t xml:space="preserve">        }]</w:t>
+        <w:br/>
+        <w:t xml:space="preserve">      }</w:t>
+        <w:br/>
+        <w:t xml:space="preserve">    ]</w:t>
+        <w:br/>
+        <w:t xml:space="preserve">  }</w:t>
+        <w:br/>
+        <w:t>}</w:t>
+        <w:br/>
+        <w:t>EOF</w:t>
+        <w:br/>
+        <w:br/>
+        <w:t># Substitute env vars and create pipeline</w:t>
+        <w:br/>
+        <w:t>envsubst &lt; /tmp/pipeline.json &gt; /tmp/pipeline_final.json</w:t>
+        <w:br/>
+        <w:t>aws codepipeline create-pipeline \</w:t>
+        <w:br/>
+        <w:t xml:space="preserve">  --cli-input-json file:///tmp/pipeline_final.json</w:t>
+      </w:r>
+    </w:p>
+    <w:p>
+      <w:pPr>
+        <w:pStyle w:val="Heading2"/>
+      </w:pPr>
+      <w:r>
+        <w:t>CLI Step 8: Verify Everything is Running</w:t>
+      </w:r>
+    </w:p>
+    <w:p>
+      <w:pPr/>
+      <w:r>
+        <w:rPr>
+          <w:rFonts w:ascii="Courier New" w:hAnsi="Courier New"/>
+          <w:sz w:val="18"/>
+        </w:rPr>
+        <w:t># Check pipeline status</w:t>
+        <w:br/>
+        <w:t>aws codepipeline get-pipeline-state \</w:t>
+        <w:br/>
+        <w:t xml:space="preserve">  --name demo-app-pipeline \</w:t>
+        <w:br/>
+        <w:t xml:space="preserve">  --query "stageStates[*].{Stage:stageName,Status:latestExecution.status}"</w:t>
+        <w:br/>
+        <w:br/>
+        <w:t># Trigger pipeline manually</w:t>
+        <w:br/>
+        <w:t>aws codepipeline start-pipeline-execution \</w:t>
+        <w:br/>
+        <w:t xml:space="preserve">  --name demo-app-pipeline</w:t>
+        <w:br/>
+        <w:br/>
+        <w:t># Check CodeDeploy deployment status</w:t>
+        <w:br/>
+        <w:t>aws deploy list-deployments \</w:t>
+        <w:br/>
+        <w:t xml:space="preserve">  --application-name $APP_NAME \</w:t>
+        <w:br/>
+        <w:t xml:space="preserve">  --deployment-group-name demo-app-deployment-group \</w:t>
+        <w:br/>
+        <w:t xml:space="preserve">  --query "deployments[0]" --output text | xargs \</w:t>
+        <w:br/>
+        <w:t>aws deploy get-deployment \</w:t>
+        <w:br/>
+        <w:t xml:space="preserve">  --query "deploymentInfo.status"</w:t>
+        <w:br/>
+        <w:br/>
+        <w:t># Get EC2 public IP to verify app</w:t>
+        <w:br/>
+        <w:t>aws ec2 describe-instances \</w:t>
+        <w:br/>
+        <w:t xml:space="preserve">  --instance-ids $INSTANCE_ID \</w:t>
+        <w:br/>
+        <w:t xml:space="preserve">  --query "Reservations[0].Instances[0].PublicIpAddress" \</w:t>
+        <w:br/>
+        <w:t xml:space="preserve">  --output text</w:t>
+      </w:r>
+    </w:p>
+    <w:p>
+      <w:pPr>
+        <w:pStyle w:val="Heading2"/>
+      </w:pPr>
+      <w:r>
+        <w:t>CLI Step 9: Teardown (Clean Up All Resources)</w:t>
+      </w:r>
+    </w:p>
+    <w:p>
+      <w:r>
+        <w:t>Run these commands to delete all resources created in this guide and avoid ongoing charges:</w:t>
+      </w:r>
+    </w:p>
+    <w:p>
+      <w:pPr/>
+      <w:r>
+        <w:rPr>
+          <w:rFonts w:ascii="Courier New" w:hAnsi="Courier New"/>
+          <w:sz w:val="18"/>
+        </w:rPr>
+        <w:t># Delete pipeline</w:t>
+        <w:br/>
+        <w:t>aws codepipeline delete-pipeline --name demo-app-pipeline</w:t>
+        <w:br/>
+        <w:br/>
+        <w:t># Delete CodeDeploy</w:t>
+        <w:br/>
+        <w:t>aws deploy delete-deployment-group \</w:t>
+        <w:br/>
+        <w:t xml:space="preserve">  --application-name $APP_NAME \</w:t>
+        <w:br/>
+        <w:t xml:space="preserve">  --deployment-group-name demo-app-deployment-group</w:t>
+        <w:br/>
+        <w:t>aws deploy delete-application --application-name $APP_NAME</w:t>
+        <w:br/>
+        <w:br/>
+        <w:t># Delete CodeBuild</w:t>
+        <w:br/>
+        <w:t>aws codebuild delete-project --name demo-app-build</w:t>
+        <w:br/>
+        <w:br/>
+        <w:t># Delete CodeCommit repo</w:t>
+        <w:br/>
+        <w:t>aws codecommit delete-repository --repository-name $APP_NAME</w:t>
+        <w:br/>
+        <w:br/>
+        <w:t># Terminate EC2 instance</w:t>
+        <w:br/>
+        <w:t>aws ec2 terminate-instances --instance-ids $INSTANCE_ID</w:t>
+        <w:br/>
+        <w:br/>
+        <w:t># Empty and delete S3 bucket</w:t>
+        <w:br/>
+        <w:t>aws s3 rm s3://$BUCKET --recursive</w:t>
+        <w:br/>
+        <w:t>aws s3api delete-bucket --bucket $BUCKET</w:t>
+        <w:br/>
+        <w:br/>
+        <w:t># Delete IAM roles</w:t>
+        <w:br/>
+        <w:t>for ROLE in CodeBuildRole-demo-app CodeDeployRole-demo-app CodePipelineRole-demo-app EC2CodeDeployRole; do</w:t>
+        <w:br/>
+        <w:t xml:space="preserve">  aws iam list-attached-role-policies --role-name $ROLE \</w:t>
+        <w:br/>
+        <w:t xml:space="preserve">    --query "AttachedPolicies[*].PolicyArn" --output text | \</w:t>
+        <w:br/>
+        <w:t xml:space="preserve">    xargs -I {} aws iam detach-role-policy --role-name $ROLE --policy-arn {}</w:t>
+        <w:br/>
+        <w:t xml:space="preserve">  aws iam delete-role --role-name $ROLE</w:t>
+        <w:br/>
+        <w:t>done</w:t>
+        <w:br/>
+        <w:t>aws iam remove-role-from-instance-profile \</w:t>
+        <w:br/>
+        <w:t xml:space="preserve">  --instance-profile-name EC2CodeDeployProfile \</w:t>
+        <w:br/>
+        <w:t xml:space="preserve">  --role-name EC2CodeDeployRole</w:t>
+        <w:br/>
+        <w:t>aws iam delete-instance-profile --instance-profile-name EC2CodeDeployProfile</w:t>
+      </w:r>
+    </w:p>
     <w:sectPr>
       <w:pgSz w:w="12240" w:h="15840"/>
       <w:pgMar w:top="1417" w:right="1417" w:bottom="1417" w:left="1417" w:header="720" w:footer="720" w:gutter="0"/>

</xml_diff>